<commit_message>
docs: resíduo de auditoria (BAIXA) — coerência de fases/CRs/tags
- AP GEST: linha Fase 5 (Implantação 🟡 Em andamento) no RESUMO POR PACOTE
- CNJ GEST: T-12 alinhada a RF02/US-03 (1ª instância EPROC + incidentes ESAJ)
- AP CR-002: escopo RF07-RF12 -> RF07-RF09, RF11, RF12 (RF10/CodigoFonteAPI e Fase 3)
- AP RAC: CR de Fase 4 -> CR-AASPAP01-002 (remove CodigoFonteAPI/Fase 3)
- CNJ GCO: evidencia de auditoria lista v230, v240 e v241

Co-Authored-By: Claude Opus 4.8 (1M context) <noreply@anthropic.com>
</commit_message>
<xml_diff>
--- a/mps-nivel-c/oficial/04_registros/AASP_Andamento-Processuais/RAC-AASPAP01-001_Relatorio-de-Acompanhamento.docx
+++ b/mps-nivel-c/oficial/04_registros/AASP_Andamento-Processuais/RAC-AASPAP01-001_Relatorio-de-Acompanhamento.docx
@@ -4284,7 +4284,7 @@
                 <w:i w:val="0"/>
                 <w:sz w:val="20"/>
               </w:rPr>
-              <w:t>CR-AASPAP01-001</w:t>
+              <w:t>CR-AASPAP01-002</w:t>
             </w:r>
           </w:p>
         </w:tc>
@@ -4309,7 +4309,7 @@
                 <w:i w:val="0"/>
                 <w:sz w:val="20"/>
               </w:rPr>
-              <w:t>Escopo adicional Fase 4: campos Observacao, Segredo, CodigoFonteAPI e tratamentos de erro</w:t>
+              <w:t>Escopo adicional Fase 4: campos Observacao e Segredo, desmembramento do RunUpdater e tratamentos de erro por instância</w:t>
             </w:r>
           </w:p>
         </w:tc>

</xml_diff>

<commit_message>
auditoria geral (Andamentos): registro da GMUD (verificação BotMax) no RAC
- RAC: registrado o trabalho GMUD (status 9, thread RunVerificacaoBotMax, endpoint VerificarBotMaxAguardando), MR !37 e deploy de agosto

Co-Authored-By: Claude Opus 4.8 <noreply@anthropic.com>
</commit_message>
<xml_diff>
--- a/mps-nivel-c/oficial/04_registros/AASP_Andamento-Processuais/RAC-AASPAP01-001_Relatorio-de-Acompanhamento.docx
+++ b/mps-nivel-c/oficial/04_registros/AASP_Andamento-Processuais/RAC-AASPAP01-001_Relatorio-de-Acompanhamento.docx
@@ -5053,6 +5053,11 @@
         <w:spacing w:before="0" w:after="160"/>
       </w:pPr>
     </w:p>
+    <w:p>
+      <w:r>
+        <w:t>GMUD (jun/2026) — Verificação BotMax (captura posterior): implementados o novo status AguardandoCaptura(9), a thread RunVerificacaoBotMax (CapturaServer), o endpoint POST /api/Captura/VerificarBotMaxAguardando, a correção dos endpoints BotMax (/subscriptions) e a remoção do Thread.Sleep no retry. Em revisão no GitLab (MR !37, branch feature/gmud-verificacao-botmax). Homologação e deploy em produção planejados para agosto/2026 (milestone "GMUD — Deploy e Encerramento").</w:t>
+      </w:r>
+    </w:p>
     <w:sectPr>
       <w:headerReference w:type="default" r:id="rId9"/>
       <w:headerReference w:type="first" r:id="rId10"/>

</xml_diff>